<commit_message>
docs: cap nhat ho so nop giai doan 1
</commit_message>
<xml_diff>
--- a/docs/project-management/Project_Charter_Quan_Ly_Ban_Ve_May_Bay.docx
+++ b/docs/project-management/Project_Charter_Quan_Ly_Ban_Ve_May_Bay.docx
@@ -721,7 +721,7 @@
         <w:ind w:left="259" w:hanging="173"/>
       </w:pPr>
       <w:r>
-        <w:t>Mã nguồn monorepo gồm apps/web chạy Next.js 16 App Router, React 19, TypeScript và CSS; apps/api chạy Spring Boot 3.5 trên Java 21; packages/shared-types và cấu hình Docker/GitHub Actions.</w:t>
+        <w:t>Mã nguồn monorepo gồm web chạy Next.js 16 App Router, React 19, TypeScript và CSS; apps/api chạy Spring Boot 3.5 trên Java 21; packages/shared-types và cấu hình Docker/GitHub Actions.</w:t>
       </w:r>
     </w:p>
     <w:p>
@@ -1255,6 +1255,60 @@
         <w:tc>
           <w:tcPr>
             <w:tcW w:type="dxa" w:w="3744"/>
+            <w:shd w:fill="F2F4F6"/>
+            <w:tcBorders>
+              <w:top w:val="single" w:sz="6" w:space="0" w:color="D1D5DB"/>
+              <w:left w:val="single" w:sz="6" w:space="0" w:color="D1D5DB"/>
+              <w:bottom w:val="single" w:sz="6" w:space="0" w:color="D1D5DB"/>
+              <w:right w:val="single" w:sz="6" w:space="0" w:color="D1D5DB"/>
+              <w:insideH w:val="single" w:sz="6" w:space="0" w:color="D1D5DB"/>
+              <w:insideV w:val="single" w:sz="6" w:space="0" w:color="D1D5DB"/>
+            </w:tcBorders>
+            <w:tcMar>
+              <w:top w:w="120" w:type="dxa"/>
+              <w:start w:w="180" w:type="dxa"/>
+              <w:bottom w:w="120" w:type="dxa"/>
+              <w:end w:w="180" w:type="dxa"/>
+            </w:tcMar>
+            <w:vAlign w:val="center"/>
+          </w:tcPr>
+          <w:p>
+            <w:r>
+              <w:t>Đỗ Lê Tuấn Kiệt - MSSV 24520895</w:t>
+            </w:r>
+          </w:p>
+        </w:tc>
+        <w:tc>
+          <w:tcPr>
+            <w:tcW w:type="dxa" w:w="6192"/>
+            <w:shd w:fill="F2F4F6"/>
+            <w:tcBorders>
+              <w:top w:val="single" w:sz="6" w:space="0" w:color="D1D5DB"/>
+              <w:left w:val="single" w:sz="6" w:space="0" w:color="D1D5DB"/>
+              <w:bottom w:val="single" w:sz="6" w:space="0" w:color="D1D5DB"/>
+              <w:right w:val="single" w:sz="6" w:space="0" w:color="D1D5DB"/>
+              <w:insideH w:val="single" w:sz="6" w:space="0" w:color="D1D5DB"/>
+              <w:insideV w:val="single" w:sz="6" w:space="0" w:color="D1D5DB"/>
+            </w:tcBorders>
+            <w:tcMar>
+              <w:top w:w="120" w:type="dxa"/>
+              <w:start w:w="180" w:type="dxa"/>
+              <w:bottom w:w="120" w:type="dxa"/>
+              <w:end w:w="180" w:type="dxa"/>
+            </w:tcMar>
+            <w:vAlign w:val="center"/>
+          </w:tcPr>
+          <w:p>
+            <w:r>
+              <w:t>Frontend/UX lead; Next.js, responsive UI, backoffice, accessibility và test giao diện.</w:t>
+            </w:r>
+          </w:p>
+        </w:tc>
+      </w:tr>
+      <w:tr>
+        <w:tc>
+          <w:tcPr>
+            <w:tcW w:type="dxa" w:w="3744"/>
             <w:shd w:fill="FFFFFF"/>
             <w:tcBorders>
               <w:top w:val="single" w:sz="6" w:space="0" w:color="D1D5DB"/>
@@ -1301,60 +1355,6 @@
           <w:p>
             <w:r>
               <w:t>Backend/database lead; Spring Boot, PostgreSQL, Flyway, API, auth/RBAC và test backend.</w:t>
-            </w:r>
-          </w:p>
-        </w:tc>
-      </w:tr>
-      <w:tr>
-        <w:tc>
-          <w:tcPr>
-            <w:tcW w:type="dxa" w:w="3744"/>
-            <w:shd w:fill="F2F4F6"/>
-            <w:tcBorders>
-              <w:top w:val="single" w:sz="6" w:space="0" w:color="D1D5DB"/>
-              <w:left w:val="single" w:sz="6" w:space="0" w:color="D1D5DB"/>
-              <w:bottom w:val="single" w:sz="6" w:space="0" w:color="D1D5DB"/>
-              <w:right w:val="single" w:sz="6" w:space="0" w:color="D1D5DB"/>
-              <w:insideH w:val="single" w:sz="6" w:space="0" w:color="D1D5DB"/>
-              <w:insideV w:val="single" w:sz="6" w:space="0" w:color="D1D5DB"/>
-            </w:tcBorders>
-            <w:tcMar>
-              <w:top w:w="120" w:type="dxa"/>
-              <w:start w:w="180" w:type="dxa"/>
-              <w:bottom w:w="120" w:type="dxa"/>
-              <w:end w:w="180" w:type="dxa"/>
-            </w:tcMar>
-            <w:vAlign w:val="center"/>
-          </w:tcPr>
-          <w:p>
-            <w:r>
-              <w:t>Đỗ Lê Tuấn Kiệt - MSSV 24520895</w:t>
-            </w:r>
-          </w:p>
-        </w:tc>
-        <w:tc>
-          <w:tcPr>
-            <w:tcW w:type="dxa" w:w="6192"/>
-            <w:shd w:fill="F2F4F6"/>
-            <w:tcBorders>
-              <w:top w:val="single" w:sz="6" w:space="0" w:color="D1D5DB"/>
-              <w:left w:val="single" w:sz="6" w:space="0" w:color="D1D5DB"/>
-              <w:bottom w:val="single" w:sz="6" w:space="0" w:color="D1D5DB"/>
-              <w:right w:val="single" w:sz="6" w:space="0" w:color="D1D5DB"/>
-              <w:insideH w:val="single" w:sz="6" w:space="0" w:color="D1D5DB"/>
-              <w:insideV w:val="single" w:sz="6" w:space="0" w:color="D1D5DB"/>
-            </w:tcBorders>
-            <w:tcMar>
-              <w:top w:w="120" w:type="dxa"/>
-              <w:start w:w="180" w:type="dxa"/>
-              <w:bottom w:w="120" w:type="dxa"/>
-              <w:end w:w="180" w:type="dxa"/>
-            </w:tcMar>
-            <w:vAlign w:val="center"/>
-          </w:tcPr>
-          <w:p>
-            <w:r>
-              <w:t>Frontend/UX lead; Next.js, responsive UI, backoffice, accessibility và test giao diện.</w:t>
             </w:r>
           </w:p>
         </w:tc>

</xml_diff>